<commit_message>
fix: sua loi Coming soon, Bang luong, them import Excel NV/GV, doi Danh muc thanh Giao vien, sua form User
</commit_message>
<xml_diff>
--- a/Log test run.docx
+++ b/Log test run.docx
@@ -4,13 +4,19 @@
   <w:body>
     <w:p>
       <w:pPr>
-        <w:rPr>
-          <w:lang w:val="en-US"/>
-        </w:rPr>
-      </w:pPr>
-      <w:proofErr w:type="spellStart"/>
-      <w:r>
-        <w:rPr>
+        <w:pStyle w:val="ListParagraph"/>
+        <w:numPr>
+          <w:ilvl w:val="0"/>
+          <w:numId w:val="1"/>
+        </w:numPr>
+        <w:rPr>
+          <w:lang w:val="en-US"/>
+        </w:rPr>
+      </w:pPr>
+      <w:proofErr w:type="spellStart"/>
+      <w:r>
+        <w:rPr>
+          <w:highlight w:val="yellow"/>
           <w:lang w:val="en-US"/>
         </w:rPr>
         <w:t>Lỗi</w:t>
@@ -18,6 +24,7 @@
       <w:proofErr w:type="spellEnd"/>
       <w:r>
         <w:rPr>
+          <w:highlight w:val="yellow"/>
           <w:lang w:val="en-US"/>
         </w:rPr>
         <w:t>:</w:t>
@@ -25,23 +32,28 @@
     </w:p>
     <w:p>
       <w:pPr>
-        <w:rPr>
-          <w:lang w:val="en-US"/>
-        </w:rPr>
-      </w:pPr>
-      <w:proofErr w:type="spellStart"/>
-      <w:r>
-        <w:rPr>
-          <w:lang w:val="en-US"/>
-        </w:rPr>
-        <w:t>Chạy</w:t>
-      </w:r>
-      <w:proofErr w:type="spellEnd"/>
-      <w:r>
-        <w:rPr>
-          <w:lang w:val="en-US"/>
-        </w:rPr>
-        <w:t xml:space="preserve"> </w:t>
+        <w:pStyle w:val="ListParagraph"/>
+        <w:numPr>
+          <w:ilvl w:val="0"/>
+          <w:numId w:val="2"/>
+        </w:numPr>
+        <w:rPr>
+          <w:lang w:val="en-US"/>
+        </w:rPr>
+      </w:pPr>
+      <w:proofErr w:type="spellStart"/>
+      <w:r>
+        <w:rPr>
+          <w:lang w:val="en-US"/>
+        </w:rPr>
+        <w:t>Mục</w:t>
+      </w:r>
+      <w:proofErr w:type="spellEnd"/>
+      <w:r>
+        <w:rPr>
+          <w:lang w:val="en-US"/>
+        </w:rPr>
+        <w:t xml:space="preserve"> “Danh </w:t>
       </w:r>
       <w:proofErr w:type="spellStart"/>
       <w:r>
@@ -55,130 +67,564 @@
         <w:rPr>
           <w:lang w:val="en-US"/>
         </w:rPr>
-        <w:t xml:space="preserve"> </w:t>
-      </w:r>
-      <w:proofErr w:type="spellStart"/>
-      <w:r>
-        <w:rPr>
-          <w:lang w:val="en-US"/>
-        </w:rPr>
-        <w:t>Thời</w:t>
-      </w:r>
-      <w:proofErr w:type="spellEnd"/>
-      <w:r>
-        <w:rPr>
-          <w:lang w:val="en-US"/>
-        </w:rPr>
-        <w:t xml:space="preserve"> </w:t>
-      </w:r>
-      <w:proofErr w:type="spellStart"/>
-      <w:r>
-        <w:rPr>
-          <w:lang w:val="en-US"/>
-        </w:rPr>
-        <w:t>khóa</w:t>
-      </w:r>
-      <w:proofErr w:type="spellEnd"/>
-      <w:r>
-        <w:rPr>
-          <w:lang w:val="en-US"/>
-        </w:rPr>
-        <w:t xml:space="preserve"> </w:t>
-      </w:r>
-      <w:proofErr w:type="spellStart"/>
-      <w:r>
-        <w:rPr>
-          <w:lang w:val="en-US"/>
-        </w:rPr>
-        <w:t>biểu</w:t>
-      </w:r>
-      <w:proofErr w:type="spellEnd"/>
-      <w:r>
-        <w:rPr>
-          <w:lang w:val="en-US"/>
-        </w:rPr>
-        <w:t xml:space="preserve"> / </w:t>
-      </w:r>
-      <w:proofErr w:type="spellStart"/>
-      <w:r>
-        <w:rPr>
-          <w:lang w:val="en-US"/>
-        </w:rPr>
-        <w:t>Tạo</w:t>
-      </w:r>
-      <w:proofErr w:type="spellEnd"/>
-      <w:r>
-        <w:rPr>
-          <w:lang w:val="en-US"/>
-        </w:rPr>
-        <w:t xml:space="preserve"> </w:t>
-      </w:r>
-      <w:proofErr w:type="spellStart"/>
-      <w:r>
-        <w:rPr>
-          <w:lang w:val="en-US"/>
-        </w:rPr>
-        <w:t>mẫu</w:t>
-      </w:r>
-      <w:proofErr w:type="spellEnd"/>
-      <w:r>
-        <w:rPr>
-          <w:lang w:val="en-US"/>
-        </w:rPr>
-        <w:t xml:space="preserve"> import </w:t>
-      </w:r>
-      <w:proofErr w:type="spellStart"/>
-      <w:r>
-        <w:rPr>
-          <w:lang w:val="en-US"/>
-        </w:rPr>
-        <w:t>gặp</w:t>
-      </w:r>
-      <w:proofErr w:type="spellEnd"/>
-      <w:r>
-        <w:rPr>
-          <w:lang w:val="en-US"/>
-        </w:rPr>
-        <w:t xml:space="preserve"> </w:t>
-      </w:r>
-      <w:proofErr w:type="spellStart"/>
-      <w:r>
-        <w:rPr>
-          <w:lang w:val="en-US"/>
-        </w:rPr>
-        <w:t>lỗi</w:t>
-      </w:r>
-      <w:proofErr w:type="spellEnd"/>
-      <w:r>
-        <w:rPr>
-          <w:lang w:val="en-US"/>
-        </w:rPr>
-        <w:t xml:space="preserve"> </w:t>
-      </w:r>
-      <w:r>
-        <w:t>{"detail":"Not authenticated"}</w:t>
+        <w:t xml:space="preserve">” </w:t>
+      </w:r>
+      <w:r>
+        <w:rPr>
+          <w:lang w:val="en-US"/>
+        </w:rPr>
+        <w:sym w:font="Wingdings" w:char="F0E0"/>
+      </w:r>
+      <w:r>
+        <w:rPr>
+          <w:lang w:val="en-US"/>
+        </w:rPr>
+        <w:t xml:space="preserve"> “</w:t>
+      </w:r>
+      <w:proofErr w:type="spellStart"/>
+      <w:r>
+        <w:rPr>
+          <w:lang w:val="en-US"/>
+        </w:rPr>
+        <w:t>Hệ</w:t>
+      </w:r>
+      <w:proofErr w:type="spellEnd"/>
+      <w:r>
+        <w:rPr>
+          <w:lang w:val="en-US"/>
+        </w:rPr>
+        <w:t xml:space="preserve"> </w:t>
+      </w:r>
+      <w:proofErr w:type="spellStart"/>
+      <w:r>
+        <w:rPr>
+          <w:lang w:val="en-US"/>
+        </w:rPr>
+        <w:t>số</w:t>
+      </w:r>
+      <w:proofErr w:type="spellEnd"/>
+      <w:r>
+        <w:rPr>
+          <w:lang w:val="en-US"/>
+        </w:rPr>
+        <w:t xml:space="preserve"> </w:t>
+      </w:r>
+      <w:proofErr w:type="spellStart"/>
+      <w:r>
+        <w:rPr>
+          <w:lang w:val="en-US"/>
+        </w:rPr>
+        <w:t>lương</w:t>
+      </w:r>
+      <w:proofErr w:type="spellEnd"/>
+      <w:r>
+        <w:rPr>
+          <w:lang w:val="en-US"/>
+        </w:rPr>
+        <w:t xml:space="preserve">” </w:t>
+      </w:r>
+      <w:proofErr w:type="spellStart"/>
+      <w:r>
+        <w:rPr>
+          <w:lang w:val="en-US"/>
+        </w:rPr>
+        <w:t>và</w:t>
+      </w:r>
+      <w:proofErr w:type="spellEnd"/>
+      <w:r>
+        <w:rPr>
+          <w:lang w:val="en-US"/>
+        </w:rPr>
+        <w:t xml:space="preserve"> “</w:t>
+      </w:r>
+      <w:proofErr w:type="spellStart"/>
+      <w:r>
+        <w:rPr>
+          <w:lang w:val="en-US"/>
+        </w:rPr>
+        <w:t>Đơn</w:t>
+      </w:r>
+      <w:proofErr w:type="spellEnd"/>
+      <w:r>
+        <w:rPr>
+          <w:lang w:val="en-US"/>
+        </w:rPr>
+        <w:t xml:space="preserve"> </w:t>
+      </w:r>
+      <w:proofErr w:type="spellStart"/>
+      <w:r>
+        <w:rPr>
+          <w:lang w:val="en-US"/>
+        </w:rPr>
+        <w:t>giá</w:t>
+      </w:r>
+      <w:proofErr w:type="spellEnd"/>
+      <w:r>
+        <w:rPr>
+          <w:lang w:val="en-US"/>
+        </w:rPr>
+        <w:t xml:space="preserve"> </w:t>
+      </w:r>
+      <w:proofErr w:type="spellStart"/>
+      <w:r>
+        <w:rPr>
+          <w:lang w:val="en-US"/>
+        </w:rPr>
+        <w:t>dạy</w:t>
+      </w:r>
+      <w:proofErr w:type="spellEnd"/>
+      <w:r>
+        <w:rPr>
+          <w:lang w:val="en-US"/>
+        </w:rPr>
+        <w:t xml:space="preserve">” </w:t>
+      </w:r>
+      <w:proofErr w:type="spellStart"/>
+      <w:r>
+        <w:rPr>
+          <w:lang w:val="en-US"/>
+        </w:rPr>
+        <w:t>đang</w:t>
+      </w:r>
+      <w:proofErr w:type="spellEnd"/>
+      <w:r>
+        <w:rPr>
+          <w:lang w:val="en-US"/>
+        </w:rPr>
+        <w:t xml:space="preserve"> </w:t>
+      </w:r>
+      <w:proofErr w:type="spellStart"/>
+      <w:r>
+        <w:rPr>
+          <w:lang w:val="en-US"/>
+        </w:rPr>
+        <w:t>hiện</w:t>
+      </w:r>
+      <w:proofErr w:type="spellEnd"/>
+      <w:r>
+        <w:rPr>
+          <w:lang w:val="en-US"/>
+        </w:rPr>
+        <w:t xml:space="preserve"> “Coming soon” </w:t>
       </w:r>
     </w:p>
     <w:p>
       <w:pPr>
-        <w:rPr>
-          <w:lang w:val="en-US"/>
-        </w:rPr>
-      </w:pPr>
+        <w:pStyle w:val="ListParagraph"/>
+        <w:numPr>
+          <w:ilvl w:val="0"/>
+          <w:numId w:val="2"/>
+        </w:numPr>
+        <w:rPr>
+          <w:lang w:val="en-US"/>
+        </w:rPr>
+      </w:pPr>
+      <w:proofErr w:type="spellStart"/>
+      <w:r>
+        <w:rPr>
+          <w:lang w:val="en-US"/>
+        </w:rPr>
+        <w:t>Mục</w:t>
+      </w:r>
+      <w:proofErr w:type="spellEnd"/>
+      <w:r>
+        <w:rPr>
+          <w:lang w:val="en-US"/>
+        </w:rPr>
+        <w:t xml:space="preserve"> “</w:t>
+      </w:r>
+      <w:proofErr w:type="spellStart"/>
+      <w:r>
+        <w:rPr>
+          <w:lang w:val="en-US"/>
+        </w:rPr>
+        <w:t>Bảng</w:t>
+      </w:r>
+      <w:proofErr w:type="spellEnd"/>
+      <w:r>
+        <w:rPr>
+          <w:lang w:val="en-US"/>
+        </w:rPr>
+        <w:t xml:space="preserve"> </w:t>
+      </w:r>
+      <w:proofErr w:type="spellStart"/>
+      <w:r>
+        <w:rPr>
+          <w:lang w:val="en-US"/>
+        </w:rPr>
+        <w:t>lương</w:t>
+      </w:r>
+      <w:proofErr w:type="spellEnd"/>
+      <w:r>
+        <w:rPr>
+          <w:lang w:val="en-US"/>
+        </w:rPr>
+        <w:t xml:space="preserve">”: click </w:t>
+      </w:r>
+      <w:proofErr w:type="spellStart"/>
+      <w:r>
+        <w:rPr>
+          <w:lang w:val="en-US"/>
+        </w:rPr>
+        <w:t>vào</w:t>
+      </w:r>
+      <w:proofErr w:type="spellEnd"/>
+      <w:r>
+        <w:rPr>
+          <w:lang w:val="en-US"/>
+        </w:rPr>
+        <w:t xml:space="preserve"> </w:t>
+      </w:r>
+      <w:proofErr w:type="spellStart"/>
+      <w:r>
+        <w:rPr>
+          <w:lang w:val="en-US"/>
+        </w:rPr>
+        <w:t>thì</w:t>
+      </w:r>
+      <w:proofErr w:type="spellEnd"/>
+      <w:r>
+        <w:rPr>
+          <w:lang w:val="en-US"/>
+        </w:rPr>
+        <w:t xml:space="preserve"> </w:t>
+      </w:r>
+      <w:proofErr w:type="spellStart"/>
+      <w:r>
+        <w:rPr>
+          <w:lang w:val="en-US"/>
+        </w:rPr>
+        <w:t>có</w:t>
+      </w:r>
+      <w:proofErr w:type="spellEnd"/>
+      <w:r>
+        <w:rPr>
+          <w:lang w:val="en-US"/>
+        </w:rPr>
+        <w:t xml:space="preserve"> </w:t>
+      </w:r>
+      <w:proofErr w:type="spellStart"/>
+      <w:r>
+        <w:rPr>
+          <w:lang w:val="en-US"/>
+        </w:rPr>
+        <w:t>lỗi</w:t>
+      </w:r>
+      <w:proofErr w:type="spellEnd"/>
+      <w:r>
+        <w:rPr>
+          <w:lang w:val="en-US"/>
+        </w:rPr>
+        <w:t xml:space="preserve"> </w:t>
+      </w:r>
+      <w:proofErr w:type="spellStart"/>
+      <w:r>
+        <w:rPr>
+          <w:lang w:val="en-US"/>
+        </w:rPr>
+        <w:t>hiển</w:t>
+      </w:r>
+      <w:proofErr w:type="spellEnd"/>
+      <w:r>
+        <w:rPr>
+          <w:lang w:val="en-US"/>
+        </w:rPr>
+        <w:t xml:space="preserve"> </w:t>
+      </w:r>
+      <w:proofErr w:type="spellStart"/>
+      <w:r>
+        <w:rPr>
+          <w:lang w:val="en-US"/>
+        </w:rPr>
+        <w:t>thị</w:t>
+      </w:r>
+      <w:proofErr w:type="spellEnd"/>
+      <w:r>
+        <w:rPr>
+          <w:lang w:val="en-US"/>
+        </w:rPr>
+        <w:t xml:space="preserve"> (</w:t>
+      </w:r>
+      <w:proofErr w:type="spellStart"/>
+      <w:r>
+        <w:rPr>
+          <w:lang w:val="en-US"/>
+        </w:rPr>
+        <w:t>có</w:t>
+      </w:r>
+      <w:proofErr w:type="spellEnd"/>
+      <w:r>
+        <w:rPr>
+          <w:lang w:val="en-US"/>
+        </w:rPr>
+        <w:t xml:space="preserve"> </w:t>
+      </w:r>
+      <w:proofErr w:type="spellStart"/>
+      <w:r>
+        <w:rPr>
+          <w:lang w:val="en-US"/>
+        </w:rPr>
+        <w:t>dữ</w:t>
+      </w:r>
+      <w:proofErr w:type="spellEnd"/>
+      <w:r>
+        <w:rPr>
+          <w:lang w:val="en-US"/>
+        </w:rPr>
+        <w:t xml:space="preserve"> </w:t>
+      </w:r>
+      <w:proofErr w:type="spellStart"/>
+      <w:r>
+        <w:rPr>
+          <w:lang w:val="en-US"/>
+        </w:rPr>
+        <w:t>liệu</w:t>
+      </w:r>
+      <w:proofErr w:type="spellEnd"/>
+      <w:r>
+        <w:rPr>
+          <w:lang w:val="en-US"/>
+        </w:rPr>
+        <w:t xml:space="preserve"> </w:t>
+      </w:r>
+      <w:proofErr w:type="spellStart"/>
+      <w:r>
+        <w:rPr>
+          <w:lang w:val="en-US"/>
+        </w:rPr>
+        <w:t>nhưng</w:t>
+      </w:r>
+      <w:proofErr w:type="spellEnd"/>
+      <w:r>
+        <w:rPr>
+          <w:lang w:val="en-US"/>
+        </w:rPr>
+        <w:t xml:space="preserve"> </w:t>
+      </w:r>
+      <w:proofErr w:type="spellStart"/>
+      <w:r>
+        <w:rPr>
+          <w:lang w:val="en-US"/>
+        </w:rPr>
+        <w:t>bị</w:t>
+      </w:r>
+      <w:proofErr w:type="spellEnd"/>
+      <w:r>
+        <w:rPr>
+          <w:lang w:val="en-US"/>
+        </w:rPr>
+        <w:t xml:space="preserve"> </w:t>
+      </w:r>
+      <w:proofErr w:type="spellStart"/>
+      <w:r>
+        <w:rPr>
+          <w:lang w:val="en-US"/>
+        </w:rPr>
+        <w:t>biến</w:t>
+      </w:r>
+      <w:proofErr w:type="spellEnd"/>
+      <w:r>
+        <w:rPr>
+          <w:lang w:val="en-US"/>
+        </w:rPr>
+        <w:t xml:space="preserve"> </w:t>
+      </w:r>
+      <w:proofErr w:type="spellStart"/>
+      <w:r>
+        <w:rPr>
+          <w:lang w:val="en-US"/>
+        </w:rPr>
+        <w:t>mất</w:t>
+      </w:r>
+      <w:proofErr w:type="spellEnd"/>
+      <w:r>
+        <w:rPr>
+          <w:lang w:val="en-US"/>
+        </w:rPr>
+        <w:t xml:space="preserve"> </w:t>
+      </w:r>
+      <w:proofErr w:type="spellStart"/>
+      <w:r>
+        <w:rPr>
+          <w:lang w:val="en-US"/>
+        </w:rPr>
+        <w:t>nhanh</w:t>
+      </w:r>
+      <w:proofErr w:type="spellEnd"/>
+      <w:r>
+        <w:rPr>
+          <w:lang w:val="en-US"/>
+        </w:rPr>
+        <w:t xml:space="preserve">, </w:t>
+      </w:r>
+      <w:proofErr w:type="spellStart"/>
+      <w:r>
+        <w:rPr>
+          <w:lang w:val="en-US"/>
+        </w:rPr>
+        <w:t>chỉ</w:t>
+      </w:r>
+      <w:proofErr w:type="spellEnd"/>
+      <w:r>
+        <w:rPr>
+          <w:lang w:val="en-US"/>
+        </w:rPr>
+        <w:t xml:space="preserve"> </w:t>
+      </w:r>
+      <w:proofErr w:type="spellStart"/>
+      <w:r>
+        <w:rPr>
+          <w:lang w:val="en-US"/>
+        </w:rPr>
+        <w:t>còn</w:t>
+      </w:r>
+      <w:proofErr w:type="spellEnd"/>
+      <w:r>
+        <w:rPr>
+          <w:lang w:val="en-US"/>
+        </w:rPr>
+        <w:t xml:space="preserve"> </w:t>
+      </w:r>
+      <w:proofErr w:type="spellStart"/>
+      <w:r>
+        <w:rPr>
+          <w:lang w:val="en-US"/>
+        </w:rPr>
+        <w:t>trang</w:t>
+      </w:r>
+      <w:proofErr w:type="spellEnd"/>
+      <w:r>
+        <w:rPr>
+          <w:lang w:val="en-US"/>
+        </w:rPr>
+        <w:t xml:space="preserve"> </w:t>
+      </w:r>
+      <w:proofErr w:type="spellStart"/>
+      <w:r>
+        <w:rPr>
+          <w:lang w:val="en-US"/>
+        </w:rPr>
+        <w:t>trắng</w:t>
+      </w:r>
+      <w:proofErr w:type="spellEnd"/>
+      <w:r>
+        <w:rPr>
+          <w:lang w:val="en-US"/>
+        </w:rPr>
+        <w:t>.</w:t>
+      </w:r>
     </w:p>
     <w:p>
       <w:pPr>
-        <w:rPr>
-          <w:lang w:val="en-US"/>
-        </w:rPr>
-      </w:pPr>
+        <w:pStyle w:val="ListParagraph"/>
+        <w:numPr>
+          <w:ilvl w:val="0"/>
+          <w:numId w:val="1"/>
+        </w:numPr>
+        <w:rPr>
+          <w:lang w:val="en-US"/>
+        </w:rPr>
+      </w:pPr>
+      <w:proofErr w:type="spellStart"/>
+      <w:r>
+        <w:rPr>
+          <w:highlight w:val="yellow"/>
+          <w:lang w:val="en-US"/>
+        </w:rPr>
+        <w:t>Thêm</w:t>
+      </w:r>
+      <w:proofErr w:type="spellEnd"/>
+      <w:r>
+        <w:rPr>
+          <w:highlight w:val="yellow"/>
+          <w:lang w:val="en-US"/>
+        </w:rPr>
+        <w:t xml:space="preserve"> </w:t>
+      </w:r>
+      <w:proofErr w:type="spellStart"/>
+      <w:r>
+        <w:rPr>
+          <w:highlight w:val="yellow"/>
+          <w:lang w:val="en-US"/>
+        </w:rPr>
+        <w:t>chức</w:t>
+      </w:r>
+      <w:proofErr w:type="spellEnd"/>
+      <w:r>
+        <w:rPr>
+          <w:highlight w:val="yellow"/>
+          <w:lang w:val="en-US"/>
+        </w:rPr>
+        <w:t xml:space="preserve"> </w:t>
+      </w:r>
+      <w:proofErr w:type="spellStart"/>
+      <w:r>
+        <w:rPr>
+          <w:highlight w:val="yellow"/>
+          <w:lang w:val="en-US"/>
+        </w:rPr>
+        <w:t>năng</w:t>
+      </w:r>
+      <w:proofErr w:type="spellEnd"/>
+      <w:r>
+        <w:rPr>
+          <w:highlight w:val="yellow"/>
+          <w:lang w:val="en-US"/>
+        </w:rPr>
+        <w:t>:</w:t>
+      </w:r>
     </w:p>
     <w:p>
       <w:pPr>
-        <w:rPr>
-          <w:lang w:val="en-US"/>
-        </w:rPr>
-      </w:pPr>
+        <w:pStyle w:val="ListParagraph"/>
+        <w:numPr>
+          <w:ilvl w:val="0"/>
+          <w:numId w:val="2"/>
+        </w:numPr>
+        <w:rPr>
+          <w:lang w:val="en-US"/>
+        </w:rPr>
+      </w:pPr>
+      <w:proofErr w:type="spellStart"/>
+      <w:r>
+        <w:rPr>
+          <w:lang w:val="en-US"/>
+        </w:rPr>
+        <w:t>Mục</w:t>
+      </w:r>
+      <w:proofErr w:type="spellEnd"/>
+      <w:r>
+        <w:rPr>
+          <w:lang w:val="en-US"/>
+        </w:rPr>
+        <w:t xml:space="preserve"> “Quản </w:t>
+      </w:r>
+      <w:proofErr w:type="spellStart"/>
+      <w:r>
+        <w:rPr>
+          <w:lang w:val="en-US"/>
+        </w:rPr>
+        <w:t>lý</w:t>
+      </w:r>
+      <w:proofErr w:type="spellEnd"/>
+      <w:r>
+        <w:rPr>
+          <w:lang w:val="en-US"/>
+        </w:rPr>
+        <w:t xml:space="preserve"> user” </w:t>
+      </w:r>
+      <w:r>
+        <w:rPr>
+          <w:lang w:val="en-US"/>
+        </w:rPr>
+        <w:sym w:font="Wingdings" w:char="F0E0"/>
+      </w:r>
+      <w:r>
+        <w:rPr>
+          <w:lang w:val="en-US"/>
+        </w:rPr>
+        <w:t xml:space="preserve"> “</w:t>
+      </w:r>
       <w:proofErr w:type="spellStart"/>
       <w:r>
         <w:rPr>
@@ -198,54 +644,411 @@
         <w:rPr>
           <w:lang w:val="en-US"/>
         </w:rPr>
-        <w:t>chức</w:t>
-      </w:r>
-      <w:proofErr w:type="spellEnd"/>
-      <w:r>
-        <w:rPr>
-          <w:lang w:val="en-US"/>
-        </w:rPr>
-        <w:t xml:space="preserve"> </w:t>
-      </w:r>
-      <w:proofErr w:type="spellStart"/>
-      <w:r>
-        <w:rPr>
-          <w:lang w:val="en-US"/>
-        </w:rPr>
-        <w:t>năng</w:t>
-      </w:r>
-      <w:proofErr w:type="spellEnd"/>
-      <w:r>
-        <w:rPr>
-          <w:lang w:val="en-US"/>
-        </w:rPr>
-        <w:t>:</w:t>
+        <w:t>người</w:t>
+      </w:r>
+      <w:proofErr w:type="spellEnd"/>
+      <w:r>
+        <w:rPr>
+          <w:lang w:val="en-US"/>
+        </w:rPr>
+        <w:t xml:space="preserve"> </w:t>
+      </w:r>
+      <w:proofErr w:type="spellStart"/>
+      <w:r>
+        <w:rPr>
+          <w:lang w:val="en-US"/>
+        </w:rPr>
+        <w:t>dùng</w:t>
+      </w:r>
+      <w:proofErr w:type="spellEnd"/>
+      <w:r>
+        <w:rPr>
+          <w:lang w:val="en-US"/>
+        </w:rPr>
+        <w:t xml:space="preserve">”: </w:t>
+      </w:r>
+      <w:proofErr w:type="spellStart"/>
+      <w:r>
+        <w:rPr>
+          <w:lang w:val="en-US"/>
+        </w:rPr>
+        <w:t>Không</w:t>
+      </w:r>
+      <w:proofErr w:type="spellEnd"/>
+      <w:r>
+        <w:rPr>
+          <w:lang w:val="en-US"/>
+        </w:rPr>
+        <w:t xml:space="preserve"> </w:t>
+      </w:r>
+      <w:proofErr w:type="spellStart"/>
+      <w:r>
+        <w:rPr>
+          <w:lang w:val="en-US"/>
+        </w:rPr>
+        <w:t>điền</w:t>
+      </w:r>
+      <w:proofErr w:type="spellEnd"/>
+      <w:r>
+        <w:rPr>
+          <w:lang w:val="en-US"/>
+        </w:rPr>
+        <w:t xml:space="preserve"> </w:t>
+      </w:r>
+      <w:proofErr w:type="spellStart"/>
+      <w:r>
+        <w:rPr>
+          <w:lang w:val="en-US"/>
+        </w:rPr>
+        <w:t>sẵn</w:t>
+      </w:r>
+      <w:proofErr w:type="spellEnd"/>
+      <w:r>
+        <w:rPr>
+          <w:lang w:val="en-US"/>
+        </w:rPr>
+        <w:t xml:space="preserve"> username, </w:t>
+      </w:r>
+      <w:proofErr w:type="spellStart"/>
+      <w:r>
+        <w:rPr>
+          <w:lang w:val="en-US"/>
+        </w:rPr>
+        <w:t>mật</w:t>
+      </w:r>
+      <w:proofErr w:type="spellEnd"/>
+      <w:r>
+        <w:rPr>
+          <w:lang w:val="en-US"/>
+        </w:rPr>
+        <w:t xml:space="preserve"> </w:t>
+      </w:r>
+      <w:proofErr w:type="spellStart"/>
+      <w:r>
+        <w:rPr>
+          <w:lang w:val="en-US"/>
+        </w:rPr>
+        <w:t>khẩu</w:t>
+      </w:r>
+      <w:proofErr w:type="spellEnd"/>
+      <w:r>
+        <w:rPr>
+          <w:lang w:val="en-US"/>
+        </w:rPr>
+        <w:t xml:space="preserve"> (</w:t>
+      </w:r>
+      <w:proofErr w:type="spellStart"/>
+      <w:r>
+        <w:rPr>
+          <w:lang w:val="en-US"/>
+        </w:rPr>
+        <w:t>mặc</w:t>
+      </w:r>
+      <w:proofErr w:type="spellEnd"/>
+      <w:r>
+        <w:rPr>
+          <w:lang w:val="en-US"/>
+        </w:rPr>
+        <w:t xml:space="preserve"> </w:t>
+      </w:r>
+      <w:proofErr w:type="spellStart"/>
+      <w:r>
+        <w:rPr>
+          <w:lang w:val="en-US"/>
+        </w:rPr>
+        <w:t>để</w:t>
+      </w:r>
+      <w:proofErr w:type="spellEnd"/>
+      <w:r>
+        <w:rPr>
+          <w:lang w:val="en-US"/>
+        </w:rPr>
+        <w:t xml:space="preserve"> </w:t>
+      </w:r>
+      <w:proofErr w:type="spellStart"/>
+      <w:r>
+        <w:rPr>
+          <w:lang w:val="en-US"/>
+        </w:rPr>
+        <w:t>trống</w:t>
+      </w:r>
+      <w:proofErr w:type="spellEnd"/>
+      <w:r>
+        <w:rPr>
+          <w:lang w:val="en-US"/>
+        </w:rPr>
+        <w:t xml:space="preserve">). Trường “Vai </w:t>
+      </w:r>
+      <w:proofErr w:type="spellStart"/>
+      <w:r>
+        <w:rPr>
+          <w:lang w:val="en-US"/>
+        </w:rPr>
+        <w:t>trò</w:t>
+      </w:r>
+      <w:proofErr w:type="spellEnd"/>
+      <w:r>
+        <w:rPr>
+          <w:lang w:val="en-US"/>
+        </w:rPr>
+        <w:t xml:space="preserve">” </w:t>
+      </w:r>
+      <w:proofErr w:type="spellStart"/>
+      <w:r>
+        <w:rPr>
+          <w:lang w:val="en-US"/>
+        </w:rPr>
+        <w:t>để</w:t>
+      </w:r>
+      <w:proofErr w:type="spellEnd"/>
+      <w:r>
+        <w:rPr>
+          <w:lang w:val="en-US"/>
+        </w:rPr>
+        <w:t xml:space="preserve"> “</w:t>
+      </w:r>
+      <w:proofErr w:type="spellStart"/>
+      <w:r>
+        <w:rPr>
+          <w:lang w:val="en-US"/>
+        </w:rPr>
+        <w:t>Nhân</w:t>
+      </w:r>
+      <w:proofErr w:type="spellEnd"/>
+      <w:r>
+        <w:rPr>
+          <w:lang w:val="en-US"/>
+        </w:rPr>
+        <w:t xml:space="preserve"> </w:t>
+      </w:r>
+      <w:proofErr w:type="spellStart"/>
+      <w:r>
+        <w:rPr>
+          <w:lang w:val="en-US"/>
+        </w:rPr>
+        <w:t>sự</w:t>
+      </w:r>
+      <w:proofErr w:type="spellEnd"/>
+      <w:r>
+        <w:rPr>
+          <w:lang w:val="en-US"/>
+        </w:rPr>
+        <w:t xml:space="preserve">” </w:t>
+      </w:r>
+      <w:proofErr w:type="spellStart"/>
+      <w:r>
+        <w:rPr>
+          <w:lang w:val="en-US"/>
+        </w:rPr>
+        <w:t>lên</w:t>
+      </w:r>
+      <w:proofErr w:type="spellEnd"/>
+      <w:r>
+        <w:rPr>
+          <w:lang w:val="en-US"/>
+        </w:rPr>
+        <w:t xml:space="preserve"> </w:t>
+      </w:r>
+      <w:proofErr w:type="spellStart"/>
+      <w:r>
+        <w:rPr>
+          <w:lang w:val="en-US"/>
+        </w:rPr>
+        <w:t>thứ</w:t>
+      </w:r>
+      <w:proofErr w:type="spellEnd"/>
+      <w:r>
+        <w:rPr>
+          <w:lang w:val="en-US"/>
+        </w:rPr>
+        <w:t xml:space="preserve"> </w:t>
+      </w:r>
+      <w:proofErr w:type="spellStart"/>
+      <w:r>
+        <w:rPr>
+          <w:lang w:val="en-US"/>
+        </w:rPr>
+        <w:t>tự</w:t>
+      </w:r>
+      <w:proofErr w:type="spellEnd"/>
+      <w:r>
+        <w:rPr>
+          <w:lang w:val="en-US"/>
+        </w:rPr>
+        <w:t xml:space="preserve"> </w:t>
+      </w:r>
+      <w:proofErr w:type="spellStart"/>
+      <w:r>
+        <w:rPr>
+          <w:lang w:val="en-US"/>
+        </w:rPr>
+        <w:t>đầu</w:t>
+      </w:r>
+      <w:proofErr w:type="spellEnd"/>
+      <w:r>
+        <w:rPr>
+          <w:lang w:val="en-US"/>
+        </w:rPr>
+        <w:t xml:space="preserve"> </w:t>
+      </w:r>
+      <w:proofErr w:type="spellStart"/>
+      <w:r>
+        <w:rPr>
+          <w:lang w:val="en-US"/>
+        </w:rPr>
+        <w:t>tiên</w:t>
+      </w:r>
+      <w:proofErr w:type="spellEnd"/>
+      <w:r>
+        <w:rPr>
+          <w:lang w:val="en-US"/>
+        </w:rPr>
+        <w:t xml:space="preserve">, “Admin” </w:t>
+      </w:r>
+      <w:proofErr w:type="spellStart"/>
+      <w:r>
+        <w:rPr>
+          <w:lang w:val="en-US"/>
+        </w:rPr>
+        <w:t>xuống</w:t>
+      </w:r>
+      <w:proofErr w:type="spellEnd"/>
+      <w:r>
+        <w:rPr>
+          <w:lang w:val="en-US"/>
+        </w:rPr>
+        <w:t xml:space="preserve"> </w:t>
+      </w:r>
+      <w:proofErr w:type="spellStart"/>
+      <w:r>
+        <w:rPr>
+          <w:lang w:val="en-US"/>
+        </w:rPr>
+        <w:t>cuối</w:t>
+      </w:r>
+      <w:proofErr w:type="spellEnd"/>
+      <w:r>
+        <w:rPr>
+          <w:lang w:val="en-US"/>
+        </w:rPr>
+        <w:t xml:space="preserve"> </w:t>
+      </w:r>
+      <w:proofErr w:type="spellStart"/>
+      <w:r>
+        <w:rPr>
+          <w:lang w:val="en-US"/>
+        </w:rPr>
+        <w:t>cùng</w:t>
+      </w:r>
+      <w:proofErr w:type="spellEnd"/>
+      <w:r>
+        <w:rPr>
+          <w:lang w:val="en-US"/>
+        </w:rPr>
+        <w:t>”</w:t>
       </w:r>
     </w:p>
     <w:p>
       <w:pPr>
-        <w:rPr>
-          <w:lang w:val="en-US"/>
-        </w:rPr>
-      </w:pPr>
-      <w:r>
-        <w:rPr>
-          <w:lang w:val="en-US"/>
-        </w:rPr>
-        <w:t xml:space="preserve">Import </w:t>
-      </w:r>
-      <w:proofErr w:type="spellStart"/>
-      <w:r>
-        <w:rPr>
-          <w:lang w:val="en-US"/>
-        </w:rPr>
-        <w:t>d</w:t>
-      </w:r>
-      <w:r>
-        <w:rPr>
-          <w:lang w:val="en-US"/>
-        </w:rPr>
-        <w:t>anh</w:t>
+        <w:pStyle w:val="ListParagraph"/>
+        <w:numPr>
+          <w:ilvl w:val="0"/>
+          <w:numId w:val="2"/>
+        </w:numPr>
+        <w:rPr>
+          <w:lang w:val="en-US"/>
+        </w:rPr>
+      </w:pPr>
+      <w:proofErr w:type="spellStart"/>
+      <w:r>
+        <w:rPr>
+          <w:lang w:val="en-US"/>
+        </w:rPr>
+        <w:t>Mục</w:t>
+      </w:r>
+      <w:proofErr w:type="spellEnd"/>
+      <w:r>
+        <w:rPr>
+          <w:lang w:val="en-US"/>
+        </w:rPr>
+        <w:t xml:space="preserve"> “</w:t>
+      </w:r>
+      <w:proofErr w:type="spellStart"/>
+      <w:r>
+        <w:rPr>
+          <w:lang w:val="en-US"/>
+        </w:rPr>
+        <w:t>Nhân</w:t>
+      </w:r>
+      <w:proofErr w:type="spellEnd"/>
+      <w:r>
+        <w:rPr>
+          <w:lang w:val="en-US"/>
+        </w:rPr>
+        <w:t xml:space="preserve"> </w:t>
+      </w:r>
+      <w:proofErr w:type="spellStart"/>
+      <w:r>
+        <w:rPr>
+          <w:lang w:val="en-US"/>
+        </w:rPr>
+        <w:t>viên</w:t>
+      </w:r>
+      <w:proofErr w:type="spellEnd"/>
+      <w:r>
+        <w:rPr>
+          <w:lang w:val="en-US"/>
+        </w:rPr>
+        <w:t xml:space="preserve">”: </w:t>
+      </w:r>
+      <w:proofErr w:type="spellStart"/>
+      <w:r>
+        <w:rPr>
+          <w:lang w:val="en-US"/>
+        </w:rPr>
+        <w:t>thêm</w:t>
+      </w:r>
+      <w:proofErr w:type="spellEnd"/>
+      <w:r>
+        <w:rPr>
+          <w:lang w:val="en-US"/>
+        </w:rPr>
+        <w:t xml:space="preserve"> </w:t>
+      </w:r>
+      <w:proofErr w:type="spellStart"/>
+      <w:r>
+        <w:rPr>
+          <w:lang w:val="en-US"/>
+        </w:rPr>
+        <w:t>chức</w:t>
+      </w:r>
+      <w:proofErr w:type="spellEnd"/>
+      <w:r>
+        <w:rPr>
+          <w:lang w:val="en-US"/>
+        </w:rPr>
+        <w:t xml:space="preserve"> </w:t>
+      </w:r>
+      <w:proofErr w:type="spellStart"/>
+      <w:r>
+        <w:rPr>
+          <w:lang w:val="en-US"/>
+        </w:rPr>
+        <w:t>năng</w:t>
+      </w:r>
+      <w:proofErr w:type="spellEnd"/>
+      <w:r>
+        <w:rPr>
+          <w:lang w:val="en-US"/>
+        </w:rPr>
+        <w:t xml:space="preserve"> import </w:t>
+      </w:r>
+      <w:proofErr w:type="spellStart"/>
+      <w:r>
+        <w:rPr>
+          <w:lang w:val="en-US"/>
+        </w:rPr>
+        <w:t>danh</w:t>
       </w:r>
       <w:proofErr w:type="spellEnd"/>
       <w:r>
@@ -294,73 +1097,518 @@
         <w:rPr>
           <w:lang w:val="en-US"/>
         </w:rPr>
-        <w:t xml:space="preserve">, </w:t>
-      </w:r>
-      <w:proofErr w:type="spellStart"/>
-      <w:r>
-        <w:rPr>
-          <w:lang w:val="en-US"/>
-        </w:rPr>
-        <w:t>giáo</w:t>
-      </w:r>
-      <w:proofErr w:type="spellEnd"/>
-      <w:r>
-        <w:rPr>
-          <w:lang w:val="en-US"/>
-        </w:rPr>
-        <w:t xml:space="preserve"> </w:t>
-      </w:r>
-      <w:proofErr w:type="spellStart"/>
-      <w:r>
-        <w:rPr>
-          <w:lang w:val="en-US"/>
-        </w:rPr>
-        <w:t>viên</w:t>
-      </w:r>
-      <w:proofErr w:type="spellEnd"/>
-      <w:r>
-        <w:rPr>
-          <w:lang w:val="en-US"/>
-        </w:rPr>
-        <w:t xml:space="preserve"> (</w:t>
-      </w:r>
-      <w:proofErr w:type="spellStart"/>
-      <w:r>
-        <w:rPr>
-          <w:lang w:val="en-US"/>
-        </w:rPr>
-        <w:t>có</w:t>
-      </w:r>
-      <w:proofErr w:type="spellEnd"/>
-      <w:r>
-        <w:rPr>
-          <w:lang w:val="en-US"/>
-        </w:rPr>
-        <w:t xml:space="preserve"> </w:t>
-      </w:r>
-      <w:proofErr w:type="spellStart"/>
-      <w:r>
-        <w:rPr>
-          <w:lang w:val="en-US"/>
-        </w:rPr>
-        <w:t>mẫu</w:t>
-      </w:r>
-      <w:proofErr w:type="spellEnd"/>
-      <w:r>
-        <w:rPr>
-          <w:lang w:val="en-US"/>
-        </w:rPr>
-        <w:t xml:space="preserve"> import)</w:t>
-      </w:r>
-      <w:r>
-        <w:rPr>
-          <w:lang w:val="en-US"/>
-        </w:rPr>
-        <w:t xml:space="preserve"> </w:t>
+        <w:t xml:space="preserve"> </w:t>
+      </w:r>
+      <w:proofErr w:type="spellStart"/>
+      <w:r>
+        <w:rPr>
+          <w:lang w:val="en-US"/>
+        </w:rPr>
+        <w:t>từ</w:t>
+      </w:r>
+      <w:proofErr w:type="spellEnd"/>
+      <w:r>
+        <w:rPr>
+          <w:lang w:val="en-US"/>
+        </w:rPr>
+        <w:t xml:space="preserve"> file excel</w:t>
       </w:r>
     </w:p>
     <w:p>
       <w:pPr>
+        <w:pStyle w:val="ListParagraph"/>
+        <w:numPr>
+          <w:ilvl w:val="0"/>
+          <w:numId w:val="2"/>
+        </w:numPr>
+        <w:rPr>
+          <w:lang w:val="en-US"/>
+        </w:rPr>
+      </w:pPr>
+      <w:proofErr w:type="spellStart"/>
+      <w:r>
+        <w:rPr>
+          <w:lang w:val="en-US"/>
+        </w:rPr>
+        <w:t>Mục</w:t>
+      </w:r>
+      <w:proofErr w:type="spellEnd"/>
+      <w:r>
+        <w:rPr>
+          <w:lang w:val="en-US"/>
+        </w:rPr>
+        <w:t xml:space="preserve"> </w:t>
+      </w:r>
+      <w:r>
+        <w:rPr>
+          <w:lang w:val="en-US"/>
+        </w:rPr>
+        <w:t xml:space="preserve">“Danh </w:t>
+      </w:r>
+      <w:proofErr w:type="spellStart"/>
+      <w:r>
+        <w:rPr>
+          <w:lang w:val="en-US"/>
+        </w:rPr>
+        <w:t>mục</w:t>
+      </w:r>
+      <w:proofErr w:type="spellEnd"/>
+      <w:r>
+        <w:rPr>
+          <w:lang w:val="en-US"/>
+        </w:rPr>
+        <w:t>”</w:t>
+      </w:r>
+      <w:r>
+        <w:rPr>
+          <w:lang w:val="en-US"/>
+        </w:rPr>
+        <w:t xml:space="preserve"> </w:t>
+      </w:r>
+      <w:proofErr w:type="spellStart"/>
+      <w:r>
+        <w:rPr>
+          <w:lang w:val="en-US"/>
+        </w:rPr>
+        <w:t>đổi</w:t>
+      </w:r>
+      <w:proofErr w:type="spellEnd"/>
+      <w:r>
+        <w:rPr>
+          <w:lang w:val="en-US"/>
+        </w:rPr>
+        <w:t xml:space="preserve"> </w:t>
+      </w:r>
+      <w:proofErr w:type="spellStart"/>
+      <w:r>
+        <w:rPr>
+          <w:lang w:val="en-US"/>
+        </w:rPr>
+        <w:t>tên</w:t>
+      </w:r>
+      <w:proofErr w:type="spellEnd"/>
+      <w:r>
+        <w:rPr>
+          <w:lang w:val="en-US"/>
+        </w:rPr>
+        <w:t xml:space="preserve"> </w:t>
+      </w:r>
+      <w:proofErr w:type="spellStart"/>
+      <w:r>
+        <w:rPr>
+          <w:lang w:val="en-US"/>
+        </w:rPr>
+        <w:t>thành</w:t>
+      </w:r>
+      <w:proofErr w:type="spellEnd"/>
+      <w:r>
+        <w:rPr>
+          <w:lang w:val="en-US"/>
+        </w:rPr>
+        <w:t xml:space="preserve"> </w:t>
+      </w:r>
+      <w:proofErr w:type="spellStart"/>
+      <w:r>
+        <w:rPr>
+          <w:lang w:val="en-US"/>
+        </w:rPr>
+        <w:t>mục</w:t>
+      </w:r>
+      <w:proofErr w:type="spellEnd"/>
+      <w:r>
+        <w:rPr>
+          <w:lang w:val="en-US"/>
+        </w:rPr>
+        <w:t xml:space="preserve">  “</w:t>
+      </w:r>
+      <w:proofErr w:type="spellStart"/>
+      <w:r>
+        <w:rPr>
+          <w:lang w:val="en-US"/>
+        </w:rPr>
+        <w:t>Giáo</w:t>
+      </w:r>
+      <w:proofErr w:type="spellEnd"/>
+      <w:r>
+        <w:rPr>
+          <w:lang w:val="en-US"/>
+        </w:rPr>
+        <w:t xml:space="preserve"> </w:t>
+      </w:r>
+      <w:proofErr w:type="spellStart"/>
+      <w:r>
+        <w:rPr>
+          <w:lang w:val="en-US"/>
+        </w:rPr>
+        <w:t>viên</w:t>
+      </w:r>
+      <w:proofErr w:type="spellEnd"/>
+      <w:r>
+        <w:rPr>
+          <w:lang w:val="en-US"/>
+        </w:rPr>
+        <w:t>”</w:t>
+      </w:r>
+      <w:r>
+        <w:rPr>
+          <w:lang w:val="en-US"/>
+        </w:rPr>
+        <w:t xml:space="preserve"> </w:t>
+      </w:r>
+      <w:proofErr w:type="spellStart"/>
+      <w:r>
+        <w:rPr>
+          <w:lang w:val="en-US"/>
+        </w:rPr>
+        <w:t>và</w:t>
+      </w:r>
+      <w:proofErr w:type="spellEnd"/>
+      <w:r>
+        <w:rPr>
+          <w:lang w:val="en-US"/>
+        </w:rPr>
+        <w:t xml:space="preserve"> </w:t>
+      </w:r>
+      <w:proofErr w:type="spellStart"/>
+      <w:r>
+        <w:rPr>
+          <w:lang w:val="en-US"/>
+        </w:rPr>
+        <w:t>thêm</w:t>
+      </w:r>
+      <w:proofErr w:type="spellEnd"/>
+      <w:r>
+        <w:rPr>
+          <w:lang w:val="en-US"/>
+        </w:rPr>
+        <w:t xml:space="preserve"> </w:t>
+      </w:r>
+      <w:proofErr w:type="spellStart"/>
+      <w:r>
+        <w:rPr>
+          <w:lang w:val="en-US"/>
+        </w:rPr>
+        <w:t>chức</w:t>
+      </w:r>
+      <w:proofErr w:type="spellEnd"/>
+      <w:r>
+        <w:rPr>
+          <w:lang w:val="en-US"/>
+        </w:rPr>
+        <w:t xml:space="preserve"> </w:t>
+      </w:r>
+      <w:proofErr w:type="spellStart"/>
+      <w:r>
+        <w:rPr>
+          <w:lang w:val="en-US"/>
+        </w:rPr>
+        <w:t>năng</w:t>
+      </w:r>
+      <w:proofErr w:type="spellEnd"/>
+      <w:r>
+        <w:rPr>
+          <w:lang w:val="en-US"/>
+        </w:rPr>
+        <w:t xml:space="preserve"> import </w:t>
+      </w:r>
+      <w:proofErr w:type="spellStart"/>
+      <w:r>
+        <w:rPr>
+          <w:lang w:val="en-US"/>
+        </w:rPr>
+        <w:t>danh</w:t>
+      </w:r>
+      <w:proofErr w:type="spellEnd"/>
+      <w:r>
+        <w:rPr>
+          <w:lang w:val="en-US"/>
+        </w:rPr>
+        <w:t xml:space="preserve"> </w:t>
+      </w:r>
+      <w:proofErr w:type="spellStart"/>
+      <w:r>
+        <w:rPr>
+          <w:lang w:val="en-US"/>
+        </w:rPr>
+        <w:t>sách</w:t>
+      </w:r>
+      <w:proofErr w:type="spellEnd"/>
+      <w:r>
+        <w:rPr>
+          <w:lang w:val="en-US"/>
+        </w:rPr>
+        <w:t xml:space="preserve"> </w:t>
+      </w:r>
+      <w:proofErr w:type="spellStart"/>
+      <w:r>
+        <w:rPr>
+          <w:lang w:val="en-US"/>
+        </w:rPr>
+        <w:t>giáo</w:t>
+      </w:r>
+      <w:proofErr w:type="spellEnd"/>
+      <w:r>
+        <w:rPr>
+          <w:lang w:val="en-US"/>
+        </w:rPr>
+        <w:t xml:space="preserve"> </w:t>
+      </w:r>
+      <w:proofErr w:type="spellStart"/>
+      <w:r>
+        <w:rPr>
+          <w:lang w:val="en-US"/>
+        </w:rPr>
+        <w:t>viên</w:t>
+      </w:r>
+      <w:proofErr w:type="spellEnd"/>
+      <w:r>
+        <w:rPr>
+          <w:lang w:val="en-US"/>
+        </w:rPr>
+        <w:t xml:space="preserve"> </w:t>
+      </w:r>
+      <w:proofErr w:type="spellStart"/>
+      <w:r>
+        <w:rPr>
+          <w:lang w:val="en-US"/>
+        </w:rPr>
+        <w:t>từ</w:t>
+      </w:r>
+      <w:proofErr w:type="spellEnd"/>
+      <w:r>
+        <w:rPr>
+          <w:lang w:val="en-US"/>
+        </w:rPr>
+        <w:t xml:space="preserve"> file excel</w:t>
+      </w:r>
+    </w:p>
+    <w:p>
+      <w:pPr>
+        <w:pStyle w:val="ListParagraph"/>
+        <w:numPr>
+          <w:ilvl w:val="0"/>
+          <w:numId w:val="2"/>
+        </w:numPr>
+        <w:rPr>
+          <w:lang w:val="en-US"/>
+        </w:rPr>
+      </w:pPr>
+    </w:p>
+    <w:p>
+      <w:pPr>
+        <w:rPr>
+          <w:lang w:val="en-US"/>
+        </w:rPr>
+      </w:pPr>
+    </w:p>
+    <w:p>
+      <w:pPr>
+        <w:rPr>
+          <w:lang w:val="en-US"/>
+        </w:rPr>
+      </w:pPr>
+    </w:p>
+    <w:p>
+      <w:pPr>
+        <w:rPr>
+          <w:lang w:val="en-US"/>
+        </w:rPr>
+      </w:pPr>
+    </w:p>
+    <w:p>
+      <w:pPr>
+        <w:rPr>
+          <w:lang w:val="en-US"/>
+        </w:rPr>
+      </w:pPr>
+      <w:proofErr w:type="spellStart"/>
+      <w:r>
+        <w:rPr>
+          <w:highlight w:val="yellow"/>
+          <w:lang w:val="en-US"/>
+        </w:rPr>
+        <w:t>Thêm</w:t>
+      </w:r>
+      <w:proofErr w:type="spellEnd"/>
+      <w:r>
+        <w:rPr>
+          <w:highlight w:val="yellow"/>
+          <w:lang w:val="en-US"/>
+        </w:rPr>
+        <w:t xml:space="preserve"> </w:t>
+      </w:r>
+      <w:proofErr w:type="spellStart"/>
+      <w:r>
+        <w:rPr>
+          <w:highlight w:val="yellow"/>
+          <w:lang w:val="en-US"/>
+        </w:rPr>
+        <w:t>chức</w:t>
+      </w:r>
+      <w:proofErr w:type="spellEnd"/>
+      <w:r>
+        <w:rPr>
+          <w:highlight w:val="yellow"/>
+          <w:lang w:val="en-US"/>
+        </w:rPr>
+        <w:t xml:space="preserve"> </w:t>
+      </w:r>
+      <w:proofErr w:type="spellStart"/>
+      <w:r>
+        <w:rPr>
+          <w:highlight w:val="yellow"/>
+          <w:lang w:val="en-US"/>
+        </w:rPr>
+        <w:t>năng</w:t>
+      </w:r>
+      <w:proofErr w:type="spellEnd"/>
+      <w:r>
+        <w:rPr>
+          <w:highlight w:val="yellow"/>
+          <w:lang w:val="en-US"/>
+        </w:rPr>
+        <w:t>:</w:t>
+      </w:r>
+    </w:p>
+    <w:p>
+      <w:pPr>
+        <w:rPr>
+          <w:lang w:val="en-US"/>
+        </w:rPr>
+      </w:pPr>
+      <w:r>
+        <w:rPr>
+          <w:lang w:val="en-US"/>
+        </w:rPr>
+        <w:t xml:space="preserve">Import </w:t>
+      </w:r>
+      <w:proofErr w:type="spellStart"/>
+      <w:r>
+        <w:rPr>
+          <w:lang w:val="en-US"/>
+        </w:rPr>
+        <w:t>d</w:t>
+      </w:r>
+      <w:r>
+        <w:rPr>
+          <w:lang w:val="en-US"/>
+        </w:rPr>
+        <w:t>anh</w:t>
+      </w:r>
+      <w:proofErr w:type="spellEnd"/>
+      <w:r>
+        <w:rPr>
+          <w:lang w:val="en-US"/>
+        </w:rPr>
+        <w:t xml:space="preserve"> </w:t>
+      </w:r>
+      <w:proofErr w:type="spellStart"/>
+      <w:r>
+        <w:rPr>
+          <w:lang w:val="en-US"/>
+        </w:rPr>
+        <w:t>sách</w:t>
+      </w:r>
+      <w:proofErr w:type="spellEnd"/>
+      <w:r>
+        <w:rPr>
+          <w:lang w:val="en-US"/>
+        </w:rPr>
+        <w:t xml:space="preserve"> </w:t>
+      </w:r>
+      <w:proofErr w:type="spellStart"/>
+      <w:r>
+        <w:rPr>
+          <w:lang w:val="en-US"/>
+        </w:rPr>
+        <w:t>nhân</w:t>
+      </w:r>
+      <w:proofErr w:type="spellEnd"/>
+      <w:r>
+        <w:rPr>
+          <w:lang w:val="en-US"/>
+        </w:rPr>
+        <w:t xml:space="preserve"> </w:t>
+      </w:r>
+      <w:proofErr w:type="spellStart"/>
+      <w:r>
+        <w:rPr>
+          <w:lang w:val="en-US"/>
+        </w:rPr>
+        <w:t>viên</w:t>
+      </w:r>
+      <w:proofErr w:type="spellEnd"/>
+      <w:r>
+        <w:rPr>
+          <w:lang w:val="en-US"/>
+        </w:rPr>
+        <w:t xml:space="preserve">, </w:t>
+      </w:r>
+      <w:proofErr w:type="spellStart"/>
+      <w:r>
+        <w:rPr>
+          <w:lang w:val="en-US"/>
+        </w:rPr>
+        <w:t>giáo</w:t>
+      </w:r>
+      <w:proofErr w:type="spellEnd"/>
+      <w:r>
+        <w:rPr>
+          <w:lang w:val="en-US"/>
+        </w:rPr>
+        <w:t xml:space="preserve"> </w:t>
+      </w:r>
+      <w:proofErr w:type="spellStart"/>
+      <w:r>
+        <w:rPr>
+          <w:lang w:val="en-US"/>
+        </w:rPr>
+        <w:t>viên</w:t>
+      </w:r>
+      <w:proofErr w:type="spellEnd"/>
+      <w:r>
+        <w:rPr>
+          <w:lang w:val="en-US"/>
+        </w:rPr>
+        <w:t xml:space="preserve"> (</w:t>
+      </w:r>
+      <w:proofErr w:type="spellStart"/>
+      <w:r>
+        <w:rPr>
+          <w:lang w:val="en-US"/>
+        </w:rPr>
+        <w:t>có</w:t>
+      </w:r>
+      <w:proofErr w:type="spellEnd"/>
+      <w:r>
+        <w:rPr>
+          <w:lang w:val="en-US"/>
+        </w:rPr>
+        <w:t xml:space="preserve"> </w:t>
+      </w:r>
+      <w:proofErr w:type="spellStart"/>
+      <w:r>
+        <w:rPr>
+          <w:lang w:val="en-US"/>
+        </w:rPr>
+        <w:t>mẫu</w:t>
+      </w:r>
+      <w:proofErr w:type="spellEnd"/>
+      <w:r>
+        <w:rPr>
+          <w:lang w:val="en-US"/>
+        </w:rPr>
+        <w:t xml:space="preserve"> import)</w:t>
+      </w:r>
+      <w:r>
+        <w:rPr>
+          <w:lang w:val="en-US"/>
+        </w:rPr>
+        <w:t xml:space="preserve"> </w:t>
+      </w:r>
+    </w:p>
+    <w:p>
+      <w:pPr>
         <w:rPr>
           <w:lang w:val="en-US"/>
         </w:rPr>
@@ -407,6 +1655,20 @@
         </w:rPr>
         <w:t xml:space="preserve"> MISA</w:t>
       </w:r>
+    </w:p>
+    <w:p>
+      <w:pPr>
+        <w:rPr>
+          <w:lang w:val="en-US"/>
+        </w:rPr>
+      </w:pPr>
+    </w:p>
+    <w:p>
+      <w:pPr>
+        <w:rPr>
+          <w:lang w:val="en-US"/>
+        </w:rPr>
+      </w:pPr>
     </w:p>
     <w:p>
       <w:pPr>
@@ -436,6 +1698,219 @@
     </w:sectPr>
   </w:body>
 </w:document>
+</file>
+
+<file path=word/numbering.xml><?xml version="1.0" encoding="utf-8"?>
+<w:numbering xmlns:wpc="http://schemas.microsoft.com/office/word/2010/wordprocessingCanvas" xmlns:cx="http://schemas.microsoft.com/office/drawing/2014/chartex" xmlns:cx1="http://schemas.microsoft.com/office/drawing/2015/9/8/chartex" xmlns:cx2="http://schemas.microsoft.com/office/drawing/2015/10/21/chartex" xmlns:cx3="http://schemas.microsoft.com/office/drawing/2016/5/9/chartex" xmlns:cx4="http://schemas.microsoft.com/office/drawing/2016/5/10/chartex" xmlns:cx5="http://schemas.microsoft.com/office/drawing/2016/5/11/chartex" xmlns:cx6="http://schemas.microsoft.com/office/drawing/2016/5/12/chartex" xmlns:cx7="http://schemas.microsoft.com/office/drawing/2016/5/13/chartex" xmlns:cx8="http://schemas.microsoft.com/office/drawing/2016/5/14/chartex" xmlns:mc="http://schemas.openxmlformats.org/markup-compatibility/2006" xmlns:aink="http://schemas.microsoft.com/office/drawing/2016/ink" xmlns:am3d="http://schemas.microsoft.com/office/drawing/2017/model3d" xmlns:o="urn:schemas-microsoft-com:office:office" xmlns:oel="http://schemas.microsoft.com/office/2019/extlst" xmlns:r="http://schemas.openxmlformats.org/officeDocument/2006/relationships" xmlns:m="http://schemas.openxmlformats.org/officeDocument/2006/math" xmlns:v="urn:schemas-microsoft-com:vml" xmlns:wp14="http://schemas.microsoft.com/office/word/2010/wordprocessingDrawing" xmlns:wp="http://schemas.openxmlformats.org/drawingml/2006/wordprocessingDrawing" xmlns:w10="urn:schemas-microsoft-com:office:word" xmlns:w="http://schemas.openxmlformats.org/wordprocessingml/2006/main" xmlns:w14="http://schemas.microsoft.com/office/word/2010/wordml" xmlns:w15="http://schemas.microsoft.com/office/word/2012/wordml" xmlns:w16cex="http://schemas.microsoft.com/office/word/2018/wordml/cex" xmlns:w16cid="http://schemas.microsoft.com/office/word/2016/wordml/cid" xmlns:w16="http://schemas.microsoft.com/office/word/2018/wordml" xmlns:w16du="http://schemas.microsoft.com/office/word/2023/wordml/word16du" xmlns:w16sdtdh="http://schemas.microsoft.com/office/word/2020/wordml/sdtdatahash" xmlns:w16sdtfl="http://schemas.microsoft.com/office/word/2024/wordml/sdtformatlock" xmlns:w16se="http://schemas.microsoft.com/office/word/2015/wordml/symex" xmlns:wpg="http://schemas.microsoft.com/office/word/2010/wordprocessingGroup" xmlns:wpi="http://schemas.microsoft.com/office/word/2010/wordprocessingInk" xmlns:wne="http://schemas.microsoft.com/office/word/2006/wordml" xmlns:wps="http://schemas.microsoft.com/office/word/2010/wordprocessingShape" mc:Ignorable="w14 w15 w16se w16cid w16 w16cex w16sdtdh w16sdtfl w16du wp14">
+  <w:abstractNum w:abstractNumId="0" w15:restartNumberingAfterBreak="0">
+    <w:nsid w:val="009453BF"/>
+    <w:multiLevelType w:val="hybridMultilevel"/>
+    <w:tmpl w:val="98C6668E"/>
+    <w:lvl w:ilvl="0" w:tplc="042A0001">
+      <w:start w:val="1"/>
+      <w:numFmt w:val="bullet"/>
+      <w:lvlText w:val=""/>
+      <w:lvlJc w:val="left"/>
+      <w:pPr>
+        <w:ind w:left="720" w:hanging="360"/>
+      </w:pPr>
+      <w:rPr>
+        <w:rFonts w:ascii="Symbol" w:hAnsi="Symbol" w:hint="default"/>
+      </w:rPr>
+    </w:lvl>
+    <w:lvl w:ilvl="1" w:tplc="042A0003" w:tentative="1">
+      <w:start w:val="1"/>
+      <w:numFmt w:val="bullet"/>
+      <w:lvlText w:val="o"/>
+      <w:lvlJc w:val="left"/>
+      <w:pPr>
+        <w:ind w:left="1440" w:hanging="360"/>
+      </w:pPr>
+      <w:rPr>
+        <w:rFonts w:ascii="Courier New" w:hAnsi="Courier New" w:cs="Courier New" w:hint="default"/>
+      </w:rPr>
+    </w:lvl>
+    <w:lvl w:ilvl="2" w:tplc="042A0005" w:tentative="1">
+      <w:start w:val="1"/>
+      <w:numFmt w:val="bullet"/>
+      <w:lvlText w:val=""/>
+      <w:lvlJc w:val="left"/>
+      <w:pPr>
+        <w:ind w:left="2160" w:hanging="360"/>
+      </w:pPr>
+      <w:rPr>
+        <w:rFonts w:ascii="Wingdings" w:hAnsi="Wingdings" w:hint="default"/>
+      </w:rPr>
+    </w:lvl>
+    <w:lvl w:ilvl="3" w:tplc="042A0001" w:tentative="1">
+      <w:start w:val="1"/>
+      <w:numFmt w:val="bullet"/>
+      <w:lvlText w:val=""/>
+      <w:lvlJc w:val="left"/>
+      <w:pPr>
+        <w:ind w:left="2880" w:hanging="360"/>
+      </w:pPr>
+      <w:rPr>
+        <w:rFonts w:ascii="Symbol" w:hAnsi="Symbol" w:hint="default"/>
+      </w:rPr>
+    </w:lvl>
+    <w:lvl w:ilvl="4" w:tplc="042A0003" w:tentative="1">
+      <w:start w:val="1"/>
+      <w:numFmt w:val="bullet"/>
+      <w:lvlText w:val="o"/>
+      <w:lvlJc w:val="left"/>
+      <w:pPr>
+        <w:ind w:left="3600" w:hanging="360"/>
+      </w:pPr>
+      <w:rPr>
+        <w:rFonts w:ascii="Courier New" w:hAnsi="Courier New" w:cs="Courier New" w:hint="default"/>
+      </w:rPr>
+    </w:lvl>
+    <w:lvl w:ilvl="5" w:tplc="042A0005" w:tentative="1">
+      <w:start w:val="1"/>
+      <w:numFmt w:val="bullet"/>
+      <w:lvlText w:val=""/>
+      <w:lvlJc w:val="left"/>
+      <w:pPr>
+        <w:ind w:left="4320" w:hanging="360"/>
+      </w:pPr>
+      <w:rPr>
+        <w:rFonts w:ascii="Wingdings" w:hAnsi="Wingdings" w:hint="default"/>
+      </w:rPr>
+    </w:lvl>
+    <w:lvl w:ilvl="6" w:tplc="042A0001" w:tentative="1">
+      <w:start w:val="1"/>
+      <w:numFmt w:val="bullet"/>
+      <w:lvlText w:val=""/>
+      <w:lvlJc w:val="left"/>
+      <w:pPr>
+        <w:ind w:left="5040" w:hanging="360"/>
+      </w:pPr>
+      <w:rPr>
+        <w:rFonts w:ascii="Symbol" w:hAnsi="Symbol" w:hint="default"/>
+      </w:rPr>
+    </w:lvl>
+    <w:lvl w:ilvl="7" w:tplc="042A0003" w:tentative="1">
+      <w:start w:val="1"/>
+      <w:numFmt w:val="bullet"/>
+      <w:lvlText w:val="o"/>
+      <w:lvlJc w:val="left"/>
+      <w:pPr>
+        <w:ind w:left="5760" w:hanging="360"/>
+      </w:pPr>
+      <w:rPr>
+        <w:rFonts w:ascii="Courier New" w:hAnsi="Courier New" w:cs="Courier New" w:hint="default"/>
+      </w:rPr>
+    </w:lvl>
+    <w:lvl w:ilvl="8" w:tplc="042A0005" w:tentative="1">
+      <w:start w:val="1"/>
+      <w:numFmt w:val="bullet"/>
+      <w:lvlText w:val=""/>
+      <w:lvlJc w:val="left"/>
+      <w:pPr>
+        <w:ind w:left="6480" w:hanging="360"/>
+      </w:pPr>
+      <w:rPr>
+        <w:rFonts w:ascii="Wingdings" w:hAnsi="Wingdings" w:hint="default"/>
+      </w:rPr>
+    </w:lvl>
+  </w:abstractNum>
+  <w:abstractNum w:abstractNumId="1" w15:restartNumberingAfterBreak="0">
+    <w:nsid w:val="7BD97DD6"/>
+    <w:multiLevelType w:val="hybridMultilevel"/>
+    <w:tmpl w:val="30FA6894"/>
+    <w:lvl w:ilvl="0" w:tplc="042A000F">
+      <w:start w:val="1"/>
+      <w:numFmt w:val="decimal"/>
+      <w:lvlText w:val="%1."/>
+      <w:lvlJc w:val="left"/>
+      <w:pPr>
+        <w:ind w:left="720" w:hanging="360"/>
+      </w:pPr>
+      <w:rPr>
+        <w:rFonts w:hint="default"/>
+      </w:rPr>
+    </w:lvl>
+    <w:lvl w:ilvl="1" w:tplc="042A0019" w:tentative="1">
+      <w:start w:val="1"/>
+      <w:numFmt w:val="lowerLetter"/>
+      <w:lvlText w:val="%2."/>
+      <w:lvlJc w:val="left"/>
+      <w:pPr>
+        <w:ind w:left="1440" w:hanging="360"/>
+      </w:pPr>
+    </w:lvl>
+    <w:lvl w:ilvl="2" w:tplc="042A001B" w:tentative="1">
+      <w:start w:val="1"/>
+      <w:numFmt w:val="lowerRoman"/>
+      <w:lvlText w:val="%3."/>
+      <w:lvlJc w:val="right"/>
+      <w:pPr>
+        <w:ind w:left="2160" w:hanging="180"/>
+      </w:pPr>
+    </w:lvl>
+    <w:lvl w:ilvl="3" w:tplc="042A000F" w:tentative="1">
+      <w:start w:val="1"/>
+      <w:numFmt w:val="decimal"/>
+      <w:lvlText w:val="%4."/>
+      <w:lvlJc w:val="left"/>
+      <w:pPr>
+        <w:ind w:left="2880" w:hanging="360"/>
+      </w:pPr>
+    </w:lvl>
+    <w:lvl w:ilvl="4" w:tplc="042A0019" w:tentative="1">
+      <w:start w:val="1"/>
+      <w:numFmt w:val="lowerLetter"/>
+      <w:lvlText w:val="%5."/>
+      <w:lvlJc w:val="left"/>
+      <w:pPr>
+        <w:ind w:left="3600" w:hanging="360"/>
+      </w:pPr>
+    </w:lvl>
+    <w:lvl w:ilvl="5" w:tplc="042A001B" w:tentative="1">
+      <w:start w:val="1"/>
+      <w:numFmt w:val="lowerRoman"/>
+      <w:lvlText w:val="%6."/>
+      <w:lvlJc w:val="right"/>
+      <w:pPr>
+        <w:ind w:left="4320" w:hanging="180"/>
+      </w:pPr>
+    </w:lvl>
+    <w:lvl w:ilvl="6" w:tplc="042A000F" w:tentative="1">
+      <w:start w:val="1"/>
+      <w:numFmt w:val="decimal"/>
+      <w:lvlText w:val="%7."/>
+      <w:lvlJc w:val="left"/>
+      <w:pPr>
+        <w:ind w:left="5040" w:hanging="360"/>
+      </w:pPr>
+    </w:lvl>
+    <w:lvl w:ilvl="7" w:tplc="042A0019" w:tentative="1">
+      <w:start w:val="1"/>
+      <w:numFmt w:val="lowerLetter"/>
+      <w:lvlText w:val="%8."/>
+      <w:lvlJc w:val="left"/>
+      <w:pPr>
+        <w:ind w:left="5760" w:hanging="360"/>
+      </w:pPr>
+    </w:lvl>
+    <w:lvl w:ilvl="8" w:tplc="042A001B" w:tentative="1">
+      <w:start w:val="1"/>
+      <w:numFmt w:val="lowerRoman"/>
+      <w:lvlText w:val="%9."/>
+      <w:lvlJc w:val="right"/>
+      <w:pPr>
+        <w:ind w:left="6480" w:hanging="180"/>
+      </w:pPr>
+    </w:lvl>
+  </w:abstractNum>
+  <w:num w:numId="1" w16cid:durableId="2134908633">
+    <w:abstractNumId w:val="1"/>
+  </w:num>
+  <w:num w:numId="2" w16cid:durableId="928737857">
+    <w:abstractNumId w:val="0"/>
+  </w:num>
+</w:numbering>
 </file>
 
 <file path=word/styles.xml><?xml version="1.0" encoding="utf-8"?>
@@ -838,6 +2313,7 @@
   <w:style w:type="paragraph" w:default="1" w:styleId="Normal">
     <w:name w:val="Normal"/>
     <w:qFormat/>
+    <w:rsid w:val="00B63C50"/>
   </w:style>
   <w:style w:type="paragraph" w:styleId="Heading1">
     <w:name w:val="heading 1"/>

</xml_diff>